<commit_message>
Replace hero and adopt Onshape workflow
</commit_message>
<xml_diff>
--- a/resources/teacher/Swinging-Sign-Teaching-Program-v1.0.docx
+++ b/resources/teacher/Swinging-Sign-Teaching-Program-v1.0.docx
@@ -3102,7 +3102,7 @@
                 <w:color w:val="17482C"/>
                 <w:sz w:val="19"/>
               </w:rPr>
-              <w:t>Inkscape tools and paths</w:t>
+              <w:t>Onshape sketches and features</w:t>
             </w:r>
           </w:p>
         </w:tc>
@@ -3132,7 +3132,7 @@
                   <w:b/>
                   <w:u w:val="none"/>
                 </w:rPr>
-                <w:t>Module 2: Inkscape tools and paths</w:t>
+                <w:t>Module 2: Onshape sketches and features</w:t>
               </w:r>
             </w:hyperlink>
             <w:r>
@@ -3141,7 +3141,7 @@
                 <w:color w:val="26342D"/>
                 <w:sz w:val="19"/>
               </w:rPr>
-              <w:t xml:space="preserve"> — Model object, node, path, text, fill, stroke and alignment concepts in a broad-to-detailed workflow. Students use the locally confirmed Inkscape version and retain a reviewable file history.</w:t>
+              <w:t xml:space="preserve"> — Model how a purposeful sketch plane, dimensions and geometric constraints capture design intent, then connect the controlled sketch to a basic Onshape feature and versioned review workflow.</w:t>
             </w:r>
           </w:p>
           <w:p>
@@ -3159,7 +3159,7 @@
                   <w:b/>
                   <w:u w:val="none"/>
                 </w:rPr>
-                <w:t>Path clinic</w:t>
+                <w:t>Onshape constraint clinic</w:t>
               </w:r>
             </w:hyperlink>
             <w:r>
@@ -3299,7 +3299,7 @@
                 <w:color w:val="26342D"/>
                 <w:sz w:val="19"/>
               </w:rPr>
-              <w:t>Path-clinic observations, tool-purpose reasons, review note, 10 MCQs and scaffolded workflow response.</w:t>
+              <w:t>Onshape constraint-clinic observations, dimension and constraint reasons, sketch-to-feature explanation, review note, 10 MCQs and scaffolded workflow response.</w:t>
             </w:r>
           </w:p>
           <w:p>
@@ -3743,7 +3743,7 @@
           <w:color w:val="26342D"/>
           <w:sz w:val="19"/>
         </w:rPr>
-        <w:t>Literacy centres on precise observation, feature-reason-effect annotations, criteria-based judgements and extended explanation. Numeracy includes scale awareness, measurement language, comparison, simple area/yield reasoning and evidence limits. Digital work includes vector/bitmap concepts, version control, file review and browser-local evidence backup.</w:t>
+        <w:t>Literacy centres on precise observation, feature-reason-effect annotations, criteria-based judgements and extended explanation. Numeracy includes scale awareness, measurement language, comparison, simple area/yield reasoning and evidence limits. Digital work includes vector/bitmap concepts, Onshape sketches and drawings, constraints, version control, file review and browser-local evidence backup.</w:t>
       </w:r>
     </w:p>
     <w:p>
@@ -4828,7 +4828,7 @@
                 <w:color w:val="17482C"/>
                 <w:sz w:val="19"/>
               </w:rPr>
-              <w:t>Files, mounting and teacher approval</w:t>
+              <w:t>Onshape drawings, mounting and approval</w:t>
             </w:r>
           </w:p>
         </w:tc>
@@ -4858,7 +4858,7 @@
                   <w:b/>
                   <w:u w:val="none"/>
                 </w:rPr>
-                <w:t>Module 3: Files, mounting and teacher approval</w:t>
+                <w:t>Module 3: Onshape drawings, mounting and approval</w:t>
               </w:r>
             </w:hyperlink>
             <w:r>
@@ -4867,7 +4867,7 @@
                 <w:color w:val="26342D"/>
                 <w:sz w:val="19"/>
               </w:rPr>
-              <w:t xml:space="preserve"> — Assemble a reviewable approval pack: versioned file, visual proposal, criteria, mounting concept and questions. Make the teacher approval gate explicit before any practical production.</w:t>
+              <w:t xml:space="preserve"> — Assemble a reviewable approval pack: current Onshape drawing, version record, criteria, mounting concept and unresolved questions. Make the teacher approval gate explicit before any export or practical production.</w:t>
             </w:r>
           </w:p>
           <w:p>
@@ -5025,7 +5025,7 @@
                 <w:color w:val="26342D"/>
                 <w:sz w:val="19"/>
               </w:rPr>
-              <w:t>Approval-pack audit, three review questions, version record, 10 MCQs and scaffolded proposal response.</w:t>
+              <w:t>Onshape drawing-and-approval audit, three review questions, version record, 10 MCQs and scaffolded proposal response.</w:t>
             </w:r>
           </w:p>
           <w:p>
@@ -8920,7 +8920,7 @@
                 <w:color w:val="26342D"/>
                 <w:sz w:val="18"/>
               </w:rPr>
-              <w:t>Inkscape version, file naming, SVG preparation, scale convention and machine-ready approval workflow.</w:t>
+              <w:t>Onshape document sharing, class folder, file naming, units, drawing template, dimension and view conventions, export and production approval workflow.</w:t>
             </w:r>
           </w:p>
         </w:tc>
@@ -8982,7 +8982,7 @@
                 <w:color w:val="26342D"/>
                 <w:sz w:val="18"/>
               </w:rPr>
-              <w:t>File submission for production review</w:t>
+              <w:t>Onshape drawing or export submission for production review</w:t>
               <w:br/>
               <w:t>Issue the current file checklist and approval state labels.</w:t>
             </w:r>
@@ -10290,7 +10290,7 @@
                 <w:color w:val="26342D"/>
                 <w:sz w:val="18"/>
               </w:rPr>
-              <w:t>Inkscape tools and paths</w:t>
+              <w:t>Onshape sketches and features</w:t>
             </w:r>
           </w:p>
         </w:tc>
@@ -11226,7 +11226,7 @@
                 <w:color w:val="26342D"/>
                 <w:sz w:val="18"/>
               </w:rPr>
-              <w:t>Files, mounting and teacher approval</w:t>
+              <w:t>Onshape drawings, mounting and approval</w:t>
             </w:r>
           </w:p>
         </w:tc>

</xml_diff>